<commit_message>
To Refactor(device-clearance): compact lifecycle form and remove horizontal scrolling
</commit_message>
<xml_diff>
--- a/document/clearancd_form.docx
+++ b/document/clearancd_form.docx
@@ -3,14 +3,59 @@
 <w:document xmlns:wpc="http://schemas.microsoft.com/office/word/2010/wordprocessingCanvas" xmlns:cx="http://schemas.microsoft.com/office/drawing/2014/chartex" xmlns:cx1="http://schemas.microsoft.com/office/drawing/2015/9/8/chartex" xmlns:cx2="http://schemas.microsoft.com/office/drawing/2015/10/21/chartex" xmlns:cx3="http://schemas.microsoft.com/office/drawing/2016/5/9/chartex" xmlns:cx4="http://schemas.microsoft.com/office/drawing/2016/5/10/chartex" xmlns:cx5="http://schemas.microsoft.com/office/drawing/2016/5/11/chartex" xmlns:cx6="http://schemas.microsoft.com/office/drawing/2016/5/12/chartex" xmlns:cx7="http://schemas.microsoft.com/office/drawing/2016/5/13/chartex" xmlns:cx8="http://schemas.microsoft.com/office/drawing/2016/5/14/chartex" xmlns:mc="http://schemas.openxmlformats.org/markup-compatibility/2006" xmlns:aink="http://schemas.microsoft.com/office/drawing/2016/ink" xmlns:am3d="http://schemas.microsoft.com/office/drawing/2017/model3d" xmlns:o="urn:schemas-microsoft-com:office:office" xmlns:oel="http://schemas.microsoft.com/office/2019/extlst" xmlns:r="http://schemas.openxmlformats.org/officeDocument/2006/relationships" xmlns:m="http://schemas.openxmlformats.org/officeDocument/2006/math" xmlns:v="urn:schemas-microsoft-com:vml" xmlns:wp14="http://schemas.microsoft.com/office/word/2010/wordprocessingDrawing" xmlns:wp="http://schemas.openxmlformats.org/drawingml/2006/wordprocessingDrawing" xmlns:w10="urn:schemas-microsoft-com:office:word" xmlns:w="http://schemas.openxmlformats.org/wordprocessingml/2006/main" xmlns:w14="http://schemas.microsoft.com/office/word/2010/wordml" xmlns:w15="http://schemas.microsoft.com/office/word/2012/wordml" xmlns:w16cex="http://schemas.microsoft.com/office/word/2018/wordml/cex" xmlns:w16cid="http://schemas.microsoft.com/office/word/2016/wordml/cid" xmlns:w16="http://schemas.microsoft.com/office/word/2018/wordml" xmlns:w16du="http://schemas.microsoft.com/office/word/2023/wordml/word16du" xmlns:w16sdtdh="http://schemas.microsoft.com/office/word/2020/wordml/sdtdatahash" xmlns:w16sdtfl="http://schemas.microsoft.com/office/word/2024/wordml/sdtformatlock" xmlns:w16se="http://schemas.microsoft.com/office/word/2015/wordml/symex" xmlns:wpg="http://schemas.microsoft.com/office/word/2010/wordprocessingGroup" xmlns:wpi="http://schemas.microsoft.com/office/word/2010/wordprocessingInk" xmlns:wne="http://schemas.microsoft.com/office/word/2006/wordml" xmlns:wps="http://schemas.microsoft.com/office/word/2010/wordprocessingShape" mc:Ignorable="w14 w15 w16se w16cid w16 w16cex w16sdtdh w16sdtfl w16du wp14">
   <w:body>
     <w:p>
-      <w:r>
-        <w:t>https://chatgpt.com/g/g-p-6aa643e2dadc8191aa94244a899b7ea1/c/6aa64409-3abc-83e8-8ad3-11f5965f2aa3</w:t>
-      </w:r>
-    </w:p>
-    <w:p/>
-    <w:p/>
-    <w:p>
       <w:hyperlink r:id="rId4" w:history="1">
+        <w:r>
+          <w:rPr>
+            <w:rStyle w:val="Hyperlink"/>
+          </w:rPr>
+          <w:t>https://chatgpt.com/g/g-p-6aa643e2dadc8191aa94244a899b7ea1/c/6aa64409-3abc-83e8-8ad3-11f5965f2aa3</w:t>
+        </w:r>
+      </w:hyperlink>
+    </w:p>
+    <w:p/>
+    <w:p>
+      <w:r>
+        <w:drawing>
+          <wp:inline distT="0" distB="0" distL="0" distR="0" wp14:anchorId="236EFB5F" wp14:editId="73AE3610">
+            <wp:extent cx="4724809" cy="6066046"/>
+            <wp:effectExtent l="0" t="0" r="0" b="0"/>
+            <wp:docPr id="379212779" name="Picture 1"/>
+            <wp:cNvGraphicFramePr>
+              <a:graphicFrameLocks xmlns:a="http://schemas.openxmlformats.org/drawingml/2006/main" noChangeAspect="1"/>
+            </wp:cNvGraphicFramePr>
+            <a:graphic xmlns:a="http://schemas.openxmlformats.org/drawingml/2006/main">
+              <a:graphicData uri="http://schemas.openxmlformats.org/drawingml/2006/picture">
+                <pic:pic xmlns:pic="http://schemas.openxmlformats.org/drawingml/2006/picture">
+                  <pic:nvPicPr>
+                    <pic:cNvPr id="379212779" name=""/>
+                    <pic:cNvPicPr/>
+                  </pic:nvPicPr>
+                  <pic:blipFill>
+                    <a:blip r:embed="rId5"/>
+                    <a:stretch>
+                      <a:fillRect/>
+                    </a:stretch>
+                  </pic:blipFill>
+                  <pic:spPr>
+                    <a:xfrm>
+                      <a:off x="0" y="0"/>
+                      <a:ext cx="4724809" cy="6066046"/>
+                    </a:xfrm>
+                    <a:prstGeom prst="rect">
+                      <a:avLst/>
+                    </a:prstGeom>
+                  </pic:spPr>
+                </pic:pic>
+              </a:graphicData>
+            </a:graphic>
+          </wp:inline>
+        </w:drawing>
+      </w:r>
+    </w:p>
+    <w:p/>
+    <w:p/>
+    <w:p>
+      <w:hyperlink r:id="rId6" w:history="1">
         <w:r>
           <w:rPr>
             <w:rStyle w:val="Hyperlink"/>
@@ -21,7 +66,7 @@
     </w:p>
     <w:p/>
     <w:p>
-      <w:hyperlink r:id="rId5" w:history="1">
+      <w:hyperlink r:id="rId7" w:history="1">
         <w:r>
           <w:rPr>
             <w:rStyle w:val="Hyperlink"/>
@@ -33,22 +78,12 @@
     <w:p/>
     <w:p/>
     <w:p>
-      <w:proofErr w:type="spellStart"/>
-      <w:r>
-        <w:t>user_images</w:t>
-      </w:r>
-      <w:proofErr w:type="spellEnd"/>
-      <w:r>
-        <w:t>/1401616150.jpg</w:t>
-      </w:r>
-      <w:r>
-        <w:t xml:space="preserve">       in </w:t>
-      </w:r>
-      <w:proofErr w:type="spellStart"/>
-      <w:r>
-        <w:t>postgresql</w:t>
-      </w:r>
-      <w:proofErr w:type="spellEnd"/>
+      <w:r>
+        <w:t>user_images/1401616150.jpg</w:t>
+      </w:r>
+      <w:r>
+        <w:t xml:space="preserve">       in postgresql</w:t>
+      </w:r>
     </w:p>
     <w:p/>
     <w:p>
@@ -57,13 +92,8 @@
       </w:r>
     </w:p>
     <w:p>
-      <w:proofErr w:type="spellStart"/>
-      <w:r>
-        <w:t>itm</w:t>
-      </w:r>
-      <w:proofErr w:type="spellEnd"/>
-      <w:r>
-        <w:t>-device-clearance-complete-folder/</w:t>
+      <w:r>
+        <w:t>itm-device-clearance-complete-folder/</w:t>
       </w:r>
     </w:p>
     <w:p>
@@ -134,13 +164,8 @@
         <w:t>──</w:t>
       </w:r>
       <w:r>
-        <w:t xml:space="preserve"> .</w:t>
-      </w:r>
-      <w:proofErr w:type="spellStart"/>
-      <w:r>
-        <w:t>env.local.example</w:t>
-      </w:r>
-      <w:proofErr w:type="spellEnd"/>
+        <w:t xml:space="preserve"> .env.local.example</w:t>
+      </w:r>
     </w:p>
     <w:p>
       <w:r>
@@ -164,39 +189,18 @@
         <w:t>──</w:t>
       </w:r>
       <w:r>
-        <w:t xml:space="preserve"> </w:t>
-      </w:r>
-      <w:proofErr w:type="spellStart"/>
-      <w:r>
-        <w:t>api</w:t>
-      </w:r>
-      <w:proofErr w:type="spellEnd"/>
-      <w:r>
-        <w:t>/</w:t>
-      </w:r>
-    </w:p>
-    <w:p>
-      <w:r>
-        <w:t xml:space="preserve">│       │   └── </w:t>
-      </w:r>
-      <w:proofErr w:type="spellStart"/>
-      <w:r>
-        <w:t>hris</w:t>
-      </w:r>
-      <w:proofErr w:type="spellEnd"/>
-      <w:r>
-        <w:t>-image/</w:t>
-      </w:r>
-    </w:p>
-    <w:p>
-      <w:r>
-        <w:t xml:space="preserve">│       │       └── </w:t>
-      </w:r>
-      <w:proofErr w:type="spellStart"/>
-      <w:r>
-        <w:t>route.ts</w:t>
-      </w:r>
-      <w:proofErr w:type="spellEnd"/>
+        <w:t xml:space="preserve"> api/</w:t>
+      </w:r>
+    </w:p>
+    <w:p>
+      <w:r>
+        <w:t>│       │   └── hris-image/</w:t>
+      </w:r>
+    </w:p>
+    <w:p>
+      <w:r>
+        <w:t>│       │       └── route.ts</w:t>
+      </w:r>
     </w:p>
     <w:p>
       <w:r>
@@ -215,77 +219,43 @@
     </w:p>
     <w:p>
       <w:r>
-        <w:t xml:space="preserve">│                   └── </w:t>
-      </w:r>
-      <w:proofErr w:type="spellStart"/>
-      <w:r>
-        <w:t>page.tsx</w:t>
-      </w:r>
-      <w:proofErr w:type="spellEnd"/>
+        <w:t>│                   └── page.tsx</w:t>
+      </w:r>
+    </w:p>
+    <w:p>
+      <w:r>
+        <w:t>└── itm/</w:t>
+      </w:r>
+    </w:p>
+    <w:p>
+      <w:r>
+        <w:t xml:space="preserve">    └── backend/</w:t>
+      </w:r>
+    </w:p>
+    <w:p>
+      <w:r>
+        <w:t xml:space="preserve">        └── internal/</w:t>
+      </w:r>
+    </w:p>
+    <w:p>
+      <w:r>
+        <w:t xml:space="preserve">            └── handler/</w:t>
+      </w:r>
+    </w:p>
+    <w:p>
+      <w:r>
+        <w:t xml:space="preserve">                └── handlers.go</w:t>
+      </w:r>
     </w:p>
     <w:p>
       <w:r>
         <w:lastRenderedPageBreak/>
-        <w:t xml:space="preserve">└── </w:t>
-      </w:r>
-      <w:proofErr w:type="spellStart"/>
-      <w:r>
-        <w:t>itm</w:t>
-      </w:r>
-      <w:proofErr w:type="spellEnd"/>
-      <w:r>
-        <w:t>/</w:t>
-      </w:r>
-    </w:p>
-    <w:p>
-      <w:r>
-        <w:t xml:space="preserve">    └── backend/</w:t>
-      </w:r>
-    </w:p>
-    <w:p>
-      <w:r>
-        <w:t xml:space="preserve">        └── internal/</w:t>
-      </w:r>
-    </w:p>
-    <w:p>
-      <w:r>
-        <w:t xml:space="preserve">            └── handler/</w:t>
-      </w:r>
-    </w:p>
-    <w:p>
-      <w:r>
-        <w:t xml:space="preserve">                └── </w:t>
-      </w:r>
-      <w:proofErr w:type="spellStart"/>
-      <w:r>
-        <w:t>handlers.go</w:t>
-      </w:r>
-      <w:proofErr w:type="spellEnd"/>
-    </w:p>
-    <w:p>
-      <w:r>
-        <w:t xml:space="preserve">The backend file is your full </w:t>
-      </w:r>
-      <w:proofErr w:type="spellStart"/>
-      <w:r>
-        <w:t>handlers.go</w:t>
-      </w:r>
-      <w:proofErr w:type="spellEnd"/>
-      <w:r>
-        <w:t xml:space="preserve">, with employee search/get/IT-person endpoints updated so the picture field is returned consistently. Your current code already joins office and personal employee tables in some places; the updated endpoints make that consistent for the clearance screen. </w:t>
-      </w:r>
-    </w:p>
-    <w:p>
-      <w:r>
-        <w:t>The frontend create/</w:t>
-      </w:r>
-      <w:proofErr w:type="spellStart"/>
-      <w:r>
-        <w:t>page.tsx</w:t>
-      </w:r>
-      <w:proofErr w:type="spellEnd"/>
-      <w:r>
-        <w:t xml:space="preserve"> includes employee search with image, selected employee photo, assigned devices, clearance checklist, assigned IT-person search, and the HRIS image proxy. You do not need to create a local employee-photo directory.</w:t>
+        <w:t xml:space="preserve">The backend file is your full handlers.go, with employee search/get/IT-person endpoints updated so the picture field is returned consistently. Your current code already joins office and personal employee tables in some places; the updated endpoints make that consistent for the clearance screen. </w:t>
+      </w:r>
+    </w:p>
+    <w:p>
+      <w:r>
+        <w:t>The frontend create/page.tsx includes employee search with image, selected employee photo, assigned devices, clearance checklist, assigned IT-person search, and the HRIS image proxy. You do not need to create a local employee-photo directory.</w:t>
       </w:r>
     </w:p>
     <w:p>
@@ -295,21 +265,16 @@
     </w:p>
     <w:p>
       <w:r>
-        <w:t>After extracting, configure the HRIS_IMAGE_* values from frontend/.</w:t>
-      </w:r>
-      <w:proofErr w:type="spellStart"/>
-      <w:r>
-        <w:t>env.local.example</w:t>
-      </w:r>
-      <w:proofErr w:type="spellEnd"/>
-      <w:r>
-        <w:t xml:space="preserve">, then restart your frontend and backend. </w:t>
-      </w:r>
-    </w:p>
-    <w:p/>
-    <w:p/>
-    <w:p>
-      <w:r>
+        <w:t xml:space="preserve">After extracting, configure the HRIS_IMAGE_* values from frontend/.env.local.example, then restart your frontend and backend. </w:t>
+      </w:r>
+    </w:p>
+    <w:p/>
+    <w:p/>
+    <w:p>
+      <w:r>
+        <w:rPr>
+          <w:noProof/>
+        </w:rPr>
         <w:drawing>
           <wp:inline distT="0" distB="0" distL="0" distR="0" wp14:anchorId="06E112B9" wp14:editId="5775387E">
             <wp:extent cx="5943600" cy="3027680"/>
@@ -326,7 +291,7 @@
                     <pic:cNvPicPr/>
                   </pic:nvPicPr>
                   <pic:blipFill>
-                    <a:blip r:embed="rId6"/>
+                    <a:blip r:embed="rId8"/>
                     <a:stretch>
                       <a:fillRect/>
                     </a:stretch>
@@ -352,6 +317,10 @@
     <w:p/>
     <w:p>
       <w:r>
+        <w:rPr>
+          <w:noProof/>
+        </w:rPr>
+        <w:lastRenderedPageBreak/>
         <w:drawing>
           <wp:inline distT="0" distB="0" distL="0" distR="0" wp14:anchorId="12D0286D" wp14:editId="5D3398CE">
             <wp:extent cx="5943600" cy="3039110"/>
@@ -368,7 +337,7 @@
                     <pic:cNvPicPr/>
                   </pic:nvPicPr>
                   <pic:blipFill>
-                    <a:blip r:embed="rId7"/>
+                    <a:blip r:embed="rId9"/>
                     <a:stretch>
                       <a:fillRect/>
                     </a:stretch>
@@ -406,67 +375,27 @@
     </w:p>
     <w:p>
       <w:r>
-        <w:t xml:space="preserve">    </w:t>
-      </w:r>
-      <w:proofErr w:type="spellStart"/>
-      <w:r>
-        <w:t>o.employee_id</w:t>
-      </w:r>
-      <w:proofErr w:type="spellEnd"/>
-      <w:r>
-        <w:t>,</w:t>
-      </w:r>
-    </w:p>
-    <w:p>
-      <w:r>
-        <w:t xml:space="preserve">    </w:t>
-      </w:r>
-      <w:proofErr w:type="spellStart"/>
-      <w:r>
-        <w:t>o.employee_name</w:t>
-      </w:r>
-      <w:proofErr w:type="spellEnd"/>
-      <w:r>
-        <w:t>,</w:t>
-      </w:r>
-    </w:p>
-    <w:p>
-      <w:r>
-        <w:t xml:space="preserve">    </w:t>
-      </w:r>
-      <w:proofErr w:type="spellStart"/>
-      <w:r>
-        <w:t>o.designation</w:t>
-      </w:r>
-      <w:proofErr w:type="spellEnd"/>
-      <w:r>
-        <w:t>,</w:t>
-      </w:r>
-    </w:p>
-    <w:p>
-      <w:r>
-        <w:t xml:space="preserve">    </w:t>
-      </w:r>
-      <w:proofErr w:type="spellStart"/>
-      <w:r>
-        <w:t>o.department_name</w:t>
-      </w:r>
-      <w:proofErr w:type="spellEnd"/>
-      <w:r>
-        <w:t>,</w:t>
-      </w:r>
-    </w:p>
-    <w:p>
-      <w:r>
-        <w:t xml:space="preserve">    </w:t>
-      </w:r>
-      <w:proofErr w:type="spellStart"/>
-      <w:r>
-        <w:t>p.picture</w:t>
-      </w:r>
-      <w:proofErr w:type="spellEnd"/>
-      <w:r>
-        <w:t>,</w:t>
+        <w:t xml:space="preserve">    o.employee_id,</w:t>
+      </w:r>
+    </w:p>
+    <w:p>
+      <w:r>
+        <w:t xml:space="preserve">    o.employee_name,</w:t>
+      </w:r>
+    </w:p>
+    <w:p>
+      <w:r>
+        <w:t xml:space="preserve">    o.designation,</w:t>
+      </w:r>
+    </w:p>
+    <w:p>
+      <w:r>
+        <w:t xml:space="preserve">    o.department_name,</w:t>
+      </w:r>
+    </w:p>
+    <w:p>
+      <w:r>
+        <w:t xml:space="preserve">    p.picture,</w:t>
       </w:r>
     </w:p>
     <w:p>
@@ -476,45 +405,24 @@
     </w:p>
     <w:p>
       <w:r>
-        <w:t xml:space="preserve">        WHEN COALESCE(BTRIM(</w:t>
-      </w:r>
-      <w:proofErr w:type="spellStart"/>
-      <w:r>
-        <w:t>p.picture</w:t>
-      </w:r>
-      <w:proofErr w:type="spellEnd"/>
-      <w:r>
-        <w:t>), '') = ''</w:t>
+        <w:t xml:space="preserve">        WHEN COALESCE(BTRIM(p.picture), '') = ''</w:t>
+      </w:r>
+    </w:p>
+    <w:p>
+      <w:r>
+        <w:t xml:space="preserve">            THEN ''</w:t>
+      </w:r>
+    </w:p>
+    <w:p>
+      <w:r>
+        <w:t xml:space="preserve">        WHEN p.picture ~* '^https?://'</w:t>
       </w:r>
     </w:p>
     <w:p>
       <w:r>
         <w:lastRenderedPageBreak/>
-        <w:t xml:space="preserve">            THEN ''</w:t>
-      </w:r>
-    </w:p>
-    <w:p>
-      <w:r>
-        <w:t xml:space="preserve">        WHEN </w:t>
-      </w:r>
-      <w:proofErr w:type="spellStart"/>
-      <w:r>
-        <w:t>p.picture</w:t>
-      </w:r>
-      <w:proofErr w:type="spellEnd"/>
-      <w:r>
-        <w:t xml:space="preserve"> ~* '^https?://'</w:t>
-      </w:r>
-    </w:p>
-    <w:p>
-      <w:r>
-        <w:t xml:space="preserve">            THEN </w:t>
-      </w:r>
-      <w:proofErr w:type="spellStart"/>
-      <w:r>
-        <w:t>p.picture</w:t>
-      </w:r>
-      <w:proofErr w:type="spellEnd"/>
+        <w:t xml:space="preserve">            THEN p.picture</w:t>
+      </w:r>
     </w:p>
     <w:p>
       <w:r>
@@ -523,98 +431,37 @@
     </w:p>
     <w:p>
       <w:r>
-        <w:t xml:space="preserve">            'https://hris.fiberathome.net/</w:t>
-      </w:r>
-      <w:proofErr w:type="spellStart"/>
-      <w:r>
-        <w:t>hris</w:t>
-      </w:r>
-      <w:proofErr w:type="spellEnd"/>
-      <w:r>
-        <w:t>/admin/' ||</w:t>
-      </w:r>
-    </w:p>
-    <w:p>
-      <w:r>
-        <w:t xml:space="preserve">            LTRIM(BTRIM(</w:t>
-      </w:r>
-      <w:proofErr w:type="spellStart"/>
-      <w:r>
-        <w:t>p.picture</w:t>
-      </w:r>
-      <w:proofErr w:type="spellEnd"/>
-      <w:r>
-        <w:t>), '/')</w:t>
-      </w:r>
-    </w:p>
-    <w:p>
-      <w:r>
-        <w:t xml:space="preserve">    END AS </w:t>
-      </w:r>
-      <w:proofErr w:type="spellStart"/>
-      <w:r>
-        <w:t>employee_image_url</w:t>
-      </w:r>
-      <w:proofErr w:type="spellEnd"/>
-    </w:p>
-    <w:p>
-      <w:r>
-        <w:t xml:space="preserve">FROM </w:t>
-      </w:r>
-      <w:proofErr w:type="spellStart"/>
-      <w:r>
-        <w:t>public.employee_office_info</w:t>
-      </w:r>
-      <w:proofErr w:type="spellEnd"/>
-      <w:r>
-        <w:t xml:space="preserve"> o</w:t>
-      </w:r>
-    </w:p>
-    <w:p>
-      <w:r>
-        <w:t xml:space="preserve">LEFT JOIN </w:t>
-      </w:r>
-      <w:proofErr w:type="spellStart"/>
-      <w:r>
-        <w:t>public.employee_personal_info</w:t>
-      </w:r>
-      <w:proofErr w:type="spellEnd"/>
-      <w:r>
-        <w:t xml:space="preserve"> p</w:t>
-      </w:r>
-    </w:p>
-    <w:p>
-      <w:r>
-        <w:t xml:space="preserve">    ON BTRIM(</w:t>
-      </w:r>
-      <w:proofErr w:type="spellStart"/>
-      <w:r>
-        <w:t>p.employee_id</w:t>
-      </w:r>
-      <w:proofErr w:type="spellEnd"/>
-      <w:r>
-        <w:t>) = BTRIM(</w:t>
-      </w:r>
-      <w:proofErr w:type="spellStart"/>
-      <w:r>
-        <w:t>o.employee_id</w:t>
-      </w:r>
-      <w:proofErr w:type="spellEnd"/>
-      <w:r>
-        <w:t>)</w:t>
-      </w:r>
-    </w:p>
-    <w:p>
-      <w:r>
-        <w:t xml:space="preserve">WHERE </w:t>
-      </w:r>
-      <w:proofErr w:type="spellStart"/>
-      <w:r>
-        <w:t>o.employee_id</w:t>
-      </w:r>
-      <w:proofErr w:type="spellEnd"/>
-      <w:r>
-        <w:t xml:space="preserve"> = '02-0501';</w:t>
+        <w:t xml:space="preserve">            'https://hris.fiberathome.net/hris/admin/' ||</w:t>
+      </w:r>
+    </w:p>
+    <w:p>
+      <w:r>
+        <w:t xml:space="preserve">            LTRIM(BTRIM(p.picture), '/')</w:t>
+      </w:r>
+    </w:p>
+    <w:p>
+      <w:r>
+        <w:t xml:space="preserve">    END AS employee_image_url</w:t>
+      </w:r>
+    </w:p>
+    <w:p>
+      <w:r>
+        <w:t>FROM public.employee_office_info o</w:t>
+      </w:r>
+    </w:p>
+    <w:p>
+      <w:r>
+        <w:t>LEFT JOIN public.employee_personal_info p</w:t>
+      </w:r>
+    </w:p>
+    <w:p>
+      <w:r>
+        <w:t xml:space="preserve">    ON BTRIM(p.employee_id) = BTRIM(o.employee_id)</w:t>
+      </w:r>
+    </w:p>
+    <w:p>
+      <w:r>
+        <w:t>WHERE o.employee_id = '02-0501';</w:t>
       </w:r>
     </w:p>
     <w:p/>
@@ -632,108 +479,50 @@
     </w:p>
     <w:p>
       <w:r>
-        <w:t xml:space="preserve">    </w:t>
-      </w:r>
-      <w:proofErr w:type="spellStart"/>
-      <w:r>
-        <w:t>o.employee_id</w:t>
-      </w:r>
-      <w:proofErr w:type="spellEnd"/>
-      <w:r>
-        <w:t>,</w:t>
-      </w:r>
-    </w:p>
-    <w:p>
-      <w:r>
-        <w:t xml:space="preserve">    </w:t>
-      </w:r>
-      <w:proofErr w:type="spellStart"/>
-      <w:r>
-        <w:t>o.employee_name</w:t>
-      </w:r>
-      <w:proofErr w:type="spellEnd"/>
-    </w:p>
-    <w:p>
-      <w:r>
-        <w:t xml:space="preserve">FROM </w:t>
-      </w:r>
-      <w:proofErr w:type="spellStart"/>
-      <w:r>
-        <w:t>public.employee_office_info</w:t>
-      </w:r>
-      <w:proofErr w:type="spellEnd"/>
-      <w:r>
-        <w:t xml:space="preserve"> o</w:t>
-      </w:r>
-    </w:p>
-    <w:p>
-      <w:r>
-        <w:t xml:space="preserve">LEFT JOIN </w:t>
-      </w:r>
-      <w:proofErr w:type="spellStart"/>
-      <w:r>
-        <w:t>public.employee_personal_info</w:t>
-      </w:r>
-      <w:proofErr w:type="spellEnd"/>
-      <w:r>
-        <w:t xml:space="preserve"> p</w:t>
-      </w:r>
-    </w:p>
-    <w:p>
-      <w:r>
-        <w:t xml:space="preserve">    ON BTRIM(</w:t>
-      </w:r>
-      <w:proofErr w:type="spellStart"/>
-      <w:r>
-        <w:t>p.employee_id</w:t>
-      </w:r>
-      <w:proofErr w:type="spellEnd"/>
-      <w:r>
-        <w:t>) = BTRIM(</w:t>
-      </w:r>
-      <w:proofErr w:type="spellStart"/>
-      <w:r>
-        <w:t>o.employee_id</w:t>
-      </w:r>
-      <w:proofErr w:type="spellEnd"/>
-      <w:r>
-        <w:t>)</w:t>
-      </w:r>
-    </w:p>
-    <w:p>
-      <w:r>
-        <w:t>WHERE COALESCE(BTRIM(</w:t>
-      </w:r>
-      <w:proofErr w:type="spellStart"/>
-      <w:r>
-        <w:t>p.picture</w:t>
-      </w:r>
-      <w:proofErr w:type="spellEnd"/>
-      <w:r>
-        <w:t>), '') = ''</w:t>
-      </w:r>
-    </w:p>
-    <w:p>
-      <w:r>
-        <w:t xml:space="preserve">ORDER BY </w:t>
-      </w:r>
-      <w:proofErr w:type="spellStart"/>
-      <w:r>
-        <w:t>o.employee_name</w:t>
-      </w:r>
-      <w:proofErr w:type="spellEnd"/>
-      <w:r>
-        <w:t>;</w:t>
-      </w:r>
-    </w:p>
-    <w:p/>
-    <w:p/>
-    <w:p/>
-    <w:p/>
-    <w:p/>
-    <w:p/>
-    <w:p>
-      <w:r>
+        <w:t xml:space="preserve">    o.employee_id,</w:t>
+      </w:r>
+    </w:p>
+    <w:p>
+      <w:r>
+        <w:t xml:space="preserve">    o.employee_name</w:t>
+      </w:r>
+    </w:p>
+    <w:p>
+      <w:r>
+        <w:t>FROM public.employee_office_info o</w:t>
+      </w:r>
+    </w:p>
+    <w:p>
+      <w:r>
+        <w:t>LEFT JOIN public.employee_personal_info p</w:t>
+      </w:r>
+    </w:p>
+    <w:p>
+      <w:r>
+        <w:t xml:space="preserve">    ON BTRIM(p.employee_id) = BTRIM(o.employee_id)</w:t>
+      </w:r>
+    </w:p>
+    <w:p>
+      <w:r>
+        <w:t>WHERE COALESCE(BTRIM(p.picture), '') = ''</w:t>
+      </w:r>
+    </w:p>
+    <w:p>
+      <w:r>
+        <w:t>ORDER BY o.employee_name;</w:t>
+      </w:r>
+    </w:p>
+    <w:p/>
+    <w:p/>
+    <w:p/>
+    <w:p/>
+    <w:p/>
+    <w:p/>
+    <w:p>
+      <w:r>
+        <w:rPr>
+          <w:noProof/>
+        </w:rPr>
         <w:drawing>
           <wp:inline distT="0" distB="0" distL="0" distR="0" wp14:anchorId="3329C85E" wp14:editId="7EB45365">
             <wp:extent cx="5943600" cy="3153410"/>
@@ -750,7 +539,7 @@
                     <pic:cNvPicPr/>
                   </pic:nvPicPr>
                   <pic:blipFill>
-                    <a:blip r:embed="rId8"/>
+                    <a:blip r:embed="rId10"/>
                     <a:stretch>
                       <a:fillRect/>
                     </a:stretch>
@@ -780,7 +569,9 @@
     <w:p/>
     <w:p>
       <w:r>
-        <w:lastRenderedPageBreak/>
+        <w:rPr>
+          <w:noProof/>
+        </w:rPr>
         <w:drawing>
           <wp:inline distT="0" distB="0" distL="0" distR="0" wp14:anchorId="2570A5D3" wp14:editId="08B27854">
             <wp:extent cx="5943600" cy="2995295"/>
@@ -797,7 +588,7 @@
                     <pic:cNvPicPr/>
                   </pic:nvPicPr>
                   <pic:blipFill>
-                    <a:blip r:embed="rId9"/>
+                    <a:blip r:embed="rId11"/>
                     <a:stretch>
                       <a:fillRect/>
                     </a:stretch>
@@ -822,26 +613,21 @@
     <w:p/>
     <w:p/>
     <w:p>
-      <w:hyperlink r:id="rId10" w:history="1">
+      <w:hyperlink r:id="rId12" w:history="1">
         <w:r>
           <w:rPr>
             <w:rStyle w:val="Hyperlink"/>
           </w:rPr>
-          <w:t>localhost:5173/dashboard/operations/</w:t>
+          <w:t>localhost:5173/dashboard/operations/create_tt</w:t>
         </w:r>
-        <w:proofErr w:type="spellStart"/>
-        <w:r>
-          <w:rPr>
-            <w:rStyle w:val="Hyperlink"/>
-          </w:rPr>
-          <w:t>create_tt</w:t>
-        </w:r>
-        <w:proofErr w:type="spellEnd"/>
       </w:hyperlink>
     </w:p>
     <w:p/>
     <w:p>
       <w:r>
+        <w:rPr>
+          <w:noProof/>
+        </w:rPr>
         <w:drawing>
           <wp:inline distT="0" distB="0" distL="0" distR="0" wp14:anchorId="11A75A4E" wp14:editId="2B1ADAF6">
             <wp:extent cx="5943600" cy="3058795"/>
@@ -858,7 +644,7 @@
                     <pic:cNvPicPr/>
                   </pic:nvPicPr>
                   <pic:blipFill>
-                    <a:blip r:embed="rId11"/>
+                    <a:blip r:embed="rId13"/>
                     <a:stretch>
                       <a:fillRect/>
                     </a:stretch>
@@ -1492,6 +1278,7 @@
   <w:style w:type="character" w:default="1" w:styleId="DefaultParagraphFont">
     <w:name w:val="Default Paragraph Font"/>
     <w:uiPriority w:val="1"/>
+    <w:semiHidden/>
     <w:unhideWhenUsed/>
   </w:style>
   <w:style w:type="table" w:default="1" w:styleId="TableNormal">

</xml_diff>